<commit_message>
Module viết bài và nộp bài: nộp lại sau yêu cầu sửa, xem lịch sử các lần nộp
</commit_message>
<xml_diff>
--- a/docx/07-design-system.docx
+++ b/docx/07-design-system.docx
@@ -8167,44 +8167,50 @@
                 <w:b/>
                 <w:bCs/>
               </w:rPr>
-              <w:t xml:space="preserve">CriterionCard</w:t>
-            </w:r>
-          </w:p>
-        </w:tc>
-        <w:tc>
-          <w:tcPr/>
-          <w:p>
-            <w:pPr>
-              <w:pStyle w:val="Compact"/>
-            </w:pPr>
-            <w:r>
-              <w:t xml:space="preserve">Một tiêu chí trên màn chấm: tên + mô tả rút gọn, checklist (Checkbox), ScorePicker, ô nhận xét</w:t>
-            </w:r>
-          </w:p>
-        </w:tc>
-        <w:tc>
-          <w:tcPr/>
-          <w:p>
-            <w:pPr>
-              <w:pStyle w:val="Compact"/>
-            </w:pPr>
-            <w:r>
-              <w:t xml:space="preserve">Thu gọn / mở rộng. Viền trái</w:t>
-            </w:r>
-            <w:r>
-              <w:t xml:space="preserve"> </w:t>
-            </w:r>
-            <w:r>
-              <w:rPr>
-                <w:rStyle w:val="VerbatimChar"/>
-              </w:rPr>
-              <w:t xml:space="preserve">brand-600</w:t>
-            </w:r>
-            <w:r>
-              <w:t xml:space="preserve"> </w:t>
-            </w:r>
-            <w:r>
-              <w:t xml:space="preserve">khi đã chấm đủ</w:t>
+              <w:t xml:space="preserve">LevelsEditor</w:t>
+            </w:r>
+            <w:r>
+              <w:t xml:space="preserve"> </w:t>
+            </w:r>
+            <w:r>
+              <w:t xml:space="preserve">(Mức 4, trình soạn bài)</w:t>
+            </w:r>
+          </w:p>
+        </w:tc>
+        <w:tc>
+          <w:tcPr/>
+          <w:p>
+            <w:pPr>
+              <w:pStyle w:val="Compact"/>
+            </w:pPr>
+            <w:r>
+              <w:t xml:space="preserve">Khung "Mức đạt" dưới checklist của tiêu chí bài Paper: mỗi mức là thẻ nền</w:t>
+            </w:r>
+            <w:r>
+              <w:t xml:space="preserve"> </w:t>
+            </w:r>
+            <w:r>
+              <w:rPr>
+                <w:rStyle w:val="VerbatimChar"/>
+              </w:rPr>
+              <w:t xml:space="preserve">neutral-25</w:t>
+            </w:r>
+            <w:r>
+              <w:t xml:space="preserve"> </w:t>
+            </w:r>
+            <w:r>
+              <w:t xml:space="preserve">gồm tên, hai ô điểm "Từ – Đến", nút xoá và ô mô tả tự giãn; lỗi chung (chồng khoảng, thiếu mức…) hiện dưới danh sách. Nút "Thêm mức" (tối đa 6), "Dùng 4 mức mặc định" khi chưa có mức</w:t>
+            </w:r>
+          </w:p>
+        </w:tc>
+        <w:tc>
+          <w:tcPr/>
+          <w:p>
+            <w:pPr>
+              <w:pStyle w:val="Compact"/>
+            </w:pPr>
+            <w:r>
+              <w:t xml:space="preserve">Bài luận IELTS không có khung này</w:t>
             </w:r>
           </w:p>
         </w:tc>
@@ -8221,36 +8227,45 @@
                 <w:b/>
                 <w:bCs/>
               </w:rPr>
-              <w:t xml:space="preserve">ChecklistItem</w:t>
-            </w:r>
-          </w:p>
-        </w:tc>
-        <w:tc>
-          <w:tcPr/>
-          <w:p>
-            <w:pPr>
-              <w:pStyle w:val="Compact"/>
-            </w:pPr>
-            <w:r>
-              <w:t xml:space="preserve">Checkbox + nội dung. Đã tick: chữ</w:t>
-            </w:r>
-            <w:r>
-              <w:t xml:space="preserve"> </w:t>
-            </w:r>
-            <w:r>
-              <w:rPr>
-                <w:rStyle w:val="VerbatimChar"/>
-              </w:rPr>
-              <w:t xml:space="preserve">neutral-500</w:t>
-            </w:r>
-          </w:p>
-        </w:tc>
-        <w:tc>
-          <w:tcPr/>
-          <w:p>
-            <w:pPr>
-              <w:pStyle w:val="Compact"/>
-            </w:pPr>
+              <w:t xml:space="preserve">CriterionCard</w:t>
+            </w:r>
+          </w:p>
+        </w:tc>
+        <w:tc>
+          <w:tcPr/>
+          <w:p>
+            <w:pPr>
+              <w:pStyle w:val="Compact"/>
+            </w:pPr>
+            <w:r>
+              <w:t xml:space="preserve">Một tiêu chí trên màn chấm: tên + mô tả rút gọn, checklist (Checkbox), ScorePicker, ô nhận xét</w:t>
+            </w:r>
+          </w:p>
+        </w:tc>
+        <w:tc>
+          <w:tcPr/>
+          <w:p>
+            <w:pPr>
+              <w:pStyle w:val="Compact"/>
+            </w:pPr>
+            <w:r>
+              <w:t xml:space="preserve">Thu gọn / mở rộng. Viền trái</w:t>
+            </w:r>
+            <w:r>
+              <w:t xml:space="preserve"> </w:t>
+            </w:r>
+            <w:r>
+              <w:rPr>
+                <w:rStyle w:val="VerbatimChar"/>
+              </w:rPr>
+              <w:t xml:space="preserve">brand-600</w:t>
+            </w:r>
+            <w:r>
+              <w:t xml:space="preserve"> </w:t>
+            </w:r>
+            <w:r>
+              <w:t xml:space="preserve">khi đã chấm đủ</w:t>
+            </w:r>
           </w:p>
         </w:tc>
       </w:tr>
@@ -8266,42 +8281,36 @@
                 <w:b/>
                 <w:bCs/>
               </w:rPr>
-              <w:t xml:space="preserve">EssayEditor</w:t>
-            </w:r>
-          </w:p>
-        </w:tc>
-        <w:tc>
-          <w:tcPr/>
-          <w:p>
-            <w:pPr>
-              <w:pStyle w:val="Compact"/>
-            </w:pPr>
-            <w:r>
-              <w:t xml:space="preserve">Vùng soạn bài: font</w:t>
-            </w:r>
-            <w:r>
-              <w:t xml:space="preserve"> </w:t>
-            </w:r>
-            <w:r>
-              <w:rPr>
-                <w:rStyle w:val="VerbatimChar"/>
-              </w:rPr>
-              <w:t xml:space="preserve">essay</w:t>
-            </w:r>
-            <w:r>
-              <w:t xml:space="preserve">, không viền, nền trắng, padding 32. Thanh trạng thái dưới: WordCounter + AutosaveIndicator</w:t>
-            </w:r>
-          </w:p>
-        </w:tc>
-        <w:tc>
-          <w:tcPr/>
-          <w:p>
-            <w:pPr>
-              <w:pStyle w:val="Compact"/>
-            </w:pPr>
-            <w:r>
-              <w:t xml:space="preserve">Chế độ chỉ đọc (đã nộp / quá hạn). Chế độ thi: chặn menu chuột phải (tuỳ chọn)</w:t>
-            </w:r>
+              <w:t xml:space="preserve">ChecklistItem</w:t>
+            </w:r>
+          </w:p>
+        </w:tc>
+        <w:tc>
+          <w:tcPr/>
+          <w:p>
+            <w:pPr>
+              <w:pStyle w:val="Compact"/>
+            </w:pPr>
+            <w:r>
+              <w:t xml:space="preserve">Checkbox + nội dung. Đã tick: chữ</w:t>
+            </w:r>
+            <w:r>
+              <w:t xml:space="preserve"> </w:t>
+            </w:r>
+            <w:r>
+              <w:rPr>
+                <w:rStyle w:val="VerbatimChar"/>
+              </w:rPr>
+              <w:t xml:space="preserve">neutral-500</w:t>
+            </w:r>
+          </w:p>
+        </w:tc>
+        <w:tc>
+          <w:tcPr/>
+          <w:p>
+            <w:pPr>
+              <w:pStyle w:val="Compact"/>
+            </w:pPr>
           </w:p>
         </w:tc>
       </w:tr>
@@ -8317,197 +8326,41 @@
                 <w:b/>
                 <w:bCs/>
               </w:rPr>
-              <w:t xml:space="preserve">EssayAnnotator</w:t>
-            </w:r>
-            <w:r>
-              <w:t xml:space="preserve"> </w:t>
-            </w:r>
-            <w:r>
-              <w:t xml:space="preserve">(thay EssayViewer, F5b)</w:t>
-            </w:r>
-          </w:p>
-        </w:tc>
-        <w:tc>
-          <w:tcPr/>
-          <w:p>
-            <w:pPr>
-              <w:pStyle w:val="Compact"/>
-            </w:pPr>
-            <w:r>
-              <w:t xml:space="preserve">Bài đã nộp kiểu "Word đã chấm": lỗi = gạch chân gợn sóng màu theo nhóm (</w:t>
-            </w:r>
-            <w:r>
-              <w:rPr>
-                <w:rStyle w:val="VerbatimChar"/>
-              </w:rPr>
-              <w:t xml:space="preserve">annot-grammar</w:t>
-            </w:r>
-            <w:r>
-              <w:t xml:space="preserve"> </w:t>
-            </w:r>
-            <w:r>
-              <w:t xml:space="preserve">/</w:t>
-            </w:r>
-            <w:r>
-              <w:t xml:space="preserve"> </w:t>
-            </w:r>
-            <w:r>
-              <w:rPr>
-                <w:rStyle w:val="VerbatimChar"/>
-              </w:rPr>
-              <w:t xml:space="preserve">-spelling</w:t>
-            </w:r>
-            <w:r>
-              <w:t xml:space="preserve"> </w:t>
-            </w:r>
-            <w:r>
-              <w:t xml:space="preserve">/</w:t>
-            </w:r>
-            <w:r>
-              <w:t xml:space="preserve"> </w:t>
-            </w:r>
-            <w:r>
-              <w:rPr>
-                <w:rStyle w:val="VerbatimChar"/>
-              </w:rPr>
-              <w:t xml:space="preserve">-vocabulary</w:t>
-            </w:r>
-            <w:r>
-              <w:t xml:space="preserve"> </w:t>
-            </w:r>
-            <w:r>
-              <w:t xml:space="preserve">/</w:t>
-            </w:r>
-            <w:r>
-              <w:t xml:space="preserve"> </w:t>
-            </w:r>
-            <w:r>
-              <w:rPr>
-                <w:rStyle w:val="VerbatimChar"/>
-              </w:rPr>
-              <w:t xml:space="preserve">-coherence</w:t>
-            </w:r>
-            <w:r>
-              <w:t xml:space="preserve"> </w:t>
-            </w:r>
-            <w:r>
-              <w:t xml:space="preserve">/</w:t>
-            </w:r>
-            <w:r>
-              <w:t xml:space="preserve"> </w:t>
-            </w:r>
-            <w:r>
-              <w:rPr>
-                <w:rStyle w:val="VerbatimChar"/>
-              </w:rPr>
-              <w:t xml:space="preserve">-punctuation</w:t>
-            </w:r>
-            <w:r>
-              <w:t xml:space="preserve"> </w:t>
-            </w:r>
-            <w:r>
-              <w:t xml:space="preserve">/</w:t>
-            </w:r>
-            <w:r>
-              <w:t xml:space="preserve"> </w:t>
-            </w:r>
-            <w:r>
-              <w:rPr>
-                <w:rStyle w:val="VerbatimChar"/>
-              </w:rPr>
-              <w:t xml:space="preserve">-other</w:t>
-            </w:r>
-            <w:r>
-              <w:t xml:space="preserve">); sửa = chữ cũ gạch ngang + chữ mới gạch chân màu</w:t>
-            </w:r>
-            <w:r>
-              <w:t xml:space="preserve"> </w:t>
-            </w:r>
-            <w:r>
-              <w:rPr>
-                <w:rStyle w:val="VerbatimChar"/>
-              </w:rPr>
-              <w:t xml:space="preserve">annot-edit</w:t>
-            </w:r>
-            <w:r>
-              <w:t xml:space="preserve">; lưu ý nền</w:t>
-            </w:r>
-            <w:r>
-              <w:t xml:space="preserve"> </w:t>
-            </w:r>
-            <w:r>
-              <w:rPr>
-                <w:rStyle w:val="VerbatimChar"/>
-              </w:rPr>
-              <w:t xml:space="preserve">highlight-comment</w:t>
-            </w:r>
-            <w:r>
-              <w:t xml:space="preserve">, dùng hay nền</w:t>
-            </w:r>
-            <w:r>
-              <w:t xml:space="preserve"> </w:t>
-            </w:r>
-            <w:r>
-              <w:rPr>
-                <w:rStyle w:val="VerbatimChar"/>
-              </w:rPr>
-              <w:t xml:space="preserve">annot-good</w:t>
-            </w:r>
-            <w:r>
-              <w:t xml:space="preserve">, có nhận xét nền</w:t>
-            </w:r>
-            <w:r>
-              <w:t xml:space="preserve"> </w:t>
-            </w:r>
-            <w:r>
-              <w:rPr>
-                <w:rStyle w:val="VerbatimChar"/>
-              </w:rPr>
-              <w:t xml:space="preserve">annot-comment</w:t>
-            </w:r>
-            <w:r>
-              <w:t xml:space="preserve"> </w:t>
-            </w:r>
-            <w:r>
-              <w:t xml:space="preserve">(đang chọn / hover:</w:t>
-            </w:r>
-            <w:r>
-              <w:t xml:space="preserve"> </w:t>
-            </w:r>
-            <w:r>
-              <w:rPr>
-                <w:rStyle w:val="VerbatimChar"/>
-              </w:rPr>
-              <w:t xml:space="preserve">annot-comment-active</w:t>
-            </w:r>
-            <w:r>
-              <w:t xml:space="preserve">). Lề trái: thanh dọc</w:t>
-            </w:r>
-            <w:r>
-              <w:t xml:space="preserve"> </w:t>
-            </w:r>
-            <w:r>
-              <w:rPr>
-                <w:rStyle w:val="VerbatimChar"/>
-              </w:rPr>
-              <w:t xml:space="preserve">brand-500</w:t>
-            </w:r>
-            <w:r>
-              <w:t xml:space="preserve"> </w:t>
-            </w:r>
-            <w:r>
-              <w:t xml:space="preserve">ở dòng có đánh dấu; lề phải 180px: bong bóng nhận xét canh theo dòng, tự dàn không chồng</w:t>
-            </w:r>
-          </w:p>
-        </w:tc>
-        <w:tc>
-          <w:tcPr/>
-          <w:p>
-            <w:pPr>
-              <w:pStyle w:val="Compact"/>
-            </w:pPr>
-            <w:r>
-              <w:t xml:space="preserve">Giáo viên: bôi đen → thanh công cụ 7 nút. Sinh viên: chỉ xem. Hàng "Hiện:" bật / tắt lớp Tô màu / Sửa / Lỗi / Nhận xét. Không dùng innerHTML — tách đoạn theo offset</w:t>
+              <w:t xml:space="preserve">EssayEditor</w:t>
+            </w:r>
+          </w:p>
+        </w:tc>
+        <w:tc>
+          <w:tcPr/>
+          <w:p>
+            <w:pPr>
+              <w:pStyle w:val="Compact"/>
+            </w:pPr>
+            <w:r>
+              <w:t xml:space="preserve">Vùng soạn bài: font</w:t>
+            </w:r>
+            <w:r>
+              <w:t xml:space="preserve"> </w:t>
+            </w:r>
+            <w:r>
+              <w:rPr>
+                <w:rStyle w:val="VerbatimChar"/>
+              </w:rPr>
+              <w:t xml:space="preserve">essay</w:t>
+            </w:r>
+            <w:r>
+              <w:t xml:space="preserve">, không viền, nền trắng, padding 32. Thanh trạng thái dưới: WordCounter + AutosaveIndicator</w:t>
+            </w:r>
+          </w:p>
+        </w:tc>
+        <w:tc>
+          <w:tcPr/>
+          <w:p>
+            <w:pPr>
+              <w:pStyle w:val="Compact"/>
+            </w:pPr>
+            <w:r>
+              <w:t xml:space="preserve">Chế độ chỉ đọc (đã nộp / quá hạn). Chế độ thi: chặn menu chuột phải (tuỳ chọn)</w:t>
             </w:r>
           </w:p>
         </w:tc>
@@ -8524,27 +8377,198 @@
                 <w:b/>
                 <w:bCs/>
               </w:rPr>
-              <w:t xml:space="preserve">InlineCommentPopover</w:t>
-            </w:r>
-          </w:p>
-        </w:tc>
-        <w:tc>
-          <w:tcPr/>
-          <w:p>
-            <w:pPr>
-              <w:pStyle w:val="Compact"/>
-            </w:pPr>
-            <w:r>
-              <w:t xml:space="preserve">Popover cạnh đoạn bôi đen: trích dẫn + ô nhận xét + Lưu / Xoá</w:t>
-            </w:r>
-          </w:p>
-        </w:tc>
-        <w:tc>
-          <w:tcPr/>
-          <w:p>
-            <w:pPr>
-              <w:pStyle w:val="Compact"/>
-            </w:pPr>
+              <w:t xml:space="preserve">EssayAnnotator</w:t>
+            </w:r>
+            <w:r>
+              <w:t xml:space="preserve"> </w:t>
+            </w:r>
+            <w:r>
+              <w:t xml:space="preserve">(thay EssayViewer, F5b)</w:t>
+            </w:r>
+          </w:p>
+        </w:tc>
+        <w:tc>
+          <w:tcPr/>
+          <w:p>
+            <w:pPr>
+              <w:pStyle w:val="Compact"/>
+            </w:pPr>
+            <w:r>
+              <w:t xml:space="preserve">Bài đã nộp kiểu "Word đã chấm": lỗi = gạch chân gợn sóng màu theo nhóm (</w:t>
+            </w:r>
+            <w:r>
+              <w:rPr>
+                <w:rStyle w:val="VerbatimChar"/>
+              </w:rPr>
+              <w:t xml:space="preserve">annot-grammar</w:t>
+            </w:r>
+            <w:r>
+              <w:t xml:space="preserve"> </w:t>
+            </w:r>
+            <w:r>
+              <w:t xml:space="preserve">/</w:t>
+            </w:r>
+            <w:r>
+              <w:t xml:space="preserve"> </w:t>
+            </w:r>
+            <w:r>
+              <w:rPr>
+                <w:rStyle w:val="VerbatimChar"/>
+              </w:rPr>
+              <w:t xml:space="preserve">-spelling</w:t>
+            </w:r>
+            <w:r>
+              <w:t xml:space="preserve"> </w:t>
+            </w:r>
+            <w:r>
+              <w:t xml:space="preserve">/</w:t>
+            </w:r>
+            <w:r>
+              <w:t xml:space="preserve"> </w:t>
+            </w:r>
+            <w:r>
+              <w:rPr>
+                <w:rStyle w:val="VerbatimChar"/>
+              </w:rPr>
+              <w:t xml:space="preserve">-vocabulary</w:t>
+            </w:r>
+            <w:r>
+              <w:t xml:space="preserve"> </w:t>
+            </w:r>
+            <w:r>
+              <w:t xml:space="preserve">/</w:t>
+            </w:r>
+            <w:r>
+              <w:t xml:space="preserve"> </w:t>
+            </w:r>
+            <w:r>
+              <w:rPr>
+                <w:rStyle w:val="VerbatimChar"/>
+              </w:rPr>
+              <w:t xml:space="preserve">-coherence</w:t>
+            </w:r>
+            <w:r>
+              <w:t xml:space="preserve"> </w:t>
+            </w:r>
+            <w:r>
+              <w:t xml:space="preserve">/</w:t>
+            </w:r>
+            <w:r>
+              <w:t xml:space="preserve"> </w:t>
+            </w:r>
+            <w:r>
+              <w:rPr>
+                <w:rStyle w:val="VerbatimChar"/>
+              </w:rPr>
+              <w:t xml:space="preserve">-punctuation</w:t>
+            </w:r>
+            <w:r>
+              <w:t xml:space="preserve"> </w:t>
+            </w:r>
+            <w:r>
+              <w:t xml:space="preserve">/</w:t>
+            </w:r>
+            <w:r>
+              <w:t xml:space="preserve"> </w:t>
+            </w:r>
+            <w:r>
+              <w:rPr>
+                <w:rStyle w:val="VerbatimChar"/>
+              </w:rPr>
+              <w:t xml:space="preserve">-other</w:t>
+            </w:r>
+            <w:r>
+              <w:t xml:space="preserve">); sửa = chữ cũ gạch ngang + chữ mới gạch chân màu</w:t>
+            </w:r>
+            <w:r>
+              <w:t xml:space="preserve"> </w:t>
+            </w:r>
+            <w:r>
+              <w:rPr>
+                <w:rStyle w:val="VerbatimChar"/>
+              </w:rPr>
+              <w:t xml:space="preserve">annot-edit</w:t>
+            </w:r>
+            <w:r>
+              <w:t xml:space="preserve">; lưu ý nền</w:t>
+            </w:r>
+            <w:r>
+              <w:t xml:space="preserve"> </w:t>
+            </w:r>
+            <w:r>
+              <w:rPr>
+                <w:rStyle w:val="VerbatimChar"/>
+              </w:rPr>
+              <w:t xml:space="preserve">highlight-comment</w:t>
+            </w:r>
+            <w:r>
+              <w:t xml:space="preserve">, dùng hay nền</w:t>
+            </w:r>
+            <w:r>
+              <w:t xml:space="preserve"> </w:t>
+            </w:r>
+            <w:r>
+              <w:rPr>
+                <w:rStyle w:val="VerbatimChar"/>
+              </w:rPr>
+              <w:t xml:space="preserve">annot-good</w:t>
+            </w:r>
+            <w:r>
+              <w:t xml:space="preserve">, có nhận xét nền</w:t>
+            </w:r>
+            <w:r>
+              <w:t xml:space="preserve"> </w:t>
+            </w:r>
+            <w:r>
+              <w:rPr>
+                <w:rStyle w:val="VerbatimChar"/>
+              </w:rPr>
+              <w:t xml:space="preserve">annot-comment</w:t>
+            </w:r>
+            <w:r>
+              <w:t xml:space="preserve"> </w:t>
+            </w:r>
+            <w:r>
+              <w:t xml:space="preserve">(đang chọn / hover:</w:t>
+            </w:r>
+            <w:r>
+              <w:t xml:space="preserve"> </w:t>
+            </w:r>
+            <w:r>
+              <w:rPr>
+                <w:rStyle w:val="VerbatimChar"/>
+              </w:rPr>
+              <w:t xml:space="preserve">annot-comment-active</w:t>
+            </w:r>
+            <w:r>
+              <w:t xml:space="preserve">). Lề trái: thanh dọc</w:t>
+            </w:r>
+            <w:r>
+              <w:t xml:space="preserve"> </w:t>
+            </w:r>
+            <w:r>
+              <w:rPr>
+                <w:rStyle w:val="VerbatimChar"/>
+              </w:rPr>
+              <w:t xml:space="preserve">brand-500</w:t>
+            </w:r>
+            <w:r>
+              <w:t xml:space="preserve"> </w:t>
+            </w:r>
+            <w:r>
+              <w:t xml:space="preserve">ở dòng có đánh dấu; lề phải 180px: bong bóng nhận xét canh theo dòng, tự dàn không chồng</w:t>
+            </w:r>
+          </w:p>
+        </w:tc>
+        <w:tc>
+          <w:tcPr/>
+          <w:p>
+            <w:pPr>
+              <w:pStyle w:val="Compact"/>
+            </w:pPr>
+            <w:r>
+              <w:t xml:space="preserve">Giáo viên: bôi đen → thanh công cụ 7 nút. Sinh viên: chỉ xem. Hàng "Hiện:" bật / tắt lớp Tô màu / Sửa / Lỗi / Nhận xét. Không dùng innerHTML — tách đoạn theo offset</w:t>
+            </w:r>
           </w:p>
         </w:tc>
       </w:tr>
@@ -8560,6 +8584,42 @@
                 <w:b/>
                 <w:bCs/>
               </w:rPr>
+              <w:t xml:space="preserve">InlineCommentPopover</w:t>
+            </w:r>
+          </w:p>
+        </w:tc>
+        <w:tc>
+          <w:tcPr/>
+          <w:p>
+            <w:pPr>
+              <w:pStyle w:val="Compact"/>
+            </w:pPr>
+            <w:r>
+              <w:t xml:space="preserve">Popover cạnh đoạn bôi đen: trích dẫn + ô nhận xét + Lưu / Xoá</w:t>
+            </w:r>
+          </w:p>
+        </w:tc>
+        <w:tc>
+          <w:tcPr/>
+          <w:p>
+            <w:pPr>
+              <w:pStyle w:val="Compact"/>
+            </w:pPr>
+          </w:p>
+        </w:tc>
+      </w:tr>
+      <w:tr>
+        <w:tc>
+          <w:tcPr/>
+          <w:p>
+            <w:pPr>
+              <w:pStyle w:val="Compact"/>
+            </w:pPr>
+            <w:r>
+              <w:rPr>
+                <w:b/>
+                <w:bCs/>
+              </w:rPr>
               <w:t xml:space="preserve">WordCounter</w:t>
             </w:r>
           </w:p>
@@ -8602,6 +8662,685 @@
             <w:pPr>
               <w:pStyle w:val="Compact"/>
             </w:pPr>
+          </w:p>
+        </w:tc>
+      </w:tr>
+      <w:tr>
+        <w:tc>
+          <w:tcPr/>
+          <w:p>
+            <w:pPr>
+              <w:pStyle w:val="Compact"/>
+            </w:pPr>
+            <w:r>
+              <w:rPr>
+                <w:b/>
+                <w:bCs/>
+              </w:rPr>
+              <w:t xml:space="preserve">PaperEditor</w:t>
+            </w:r>
+            <w:r>
+              <w:t xml:space="preserve"> </w:t>
+            </w:r>
+            <w:r>
+              <w:t xml:space="preserve">(Mức 4)</w:t>
+            </w:r>
+          </w:p>
+        </w:tc>
+        <w:tc>
+          <w:tcPr/>
+          <w:p>
+            <w:pPr>
+              <w:pStyle w:val="Compact"/>
+            </w:pPr>
+            <w:r>
+              <w:t xml:space="preserve">Trình soạn paper (TipTap): tờ giấy trắng rộng tối đa 960, chữ bài font</w:t>
+            </w:r>
+            <w:r>
+              <w:t xml:space="preserve"> </w:t>
+            </w:r>
+            <w:r>
+              <w:rPr>
+                <w:rStyle w:val="VerbatimChar"/>
+              </w:rPr>
+              <w:t xml:space="preserve">essay</w:t>
+            </w:r>
+            <w:r>
+              <w:t xml:space="preserve">. Tài liệu gồm các</w:t>
+            </w:r>
+            <w:r>
+              <w:t xml:space="preserve"> </w:t>
+            </w:r>
+            <w:r>
+              <w:rPr>
+                <w:b/>
+                <w:bCs/>
+              </w:rPr>
+              <w:t xml:space="preserve">mục cố định</w:t>
+            </w:r>
+            <w:r>
+              <w:t xml:space="preserve"> </w:t>
+            </w:r>
+            <w:r>
+              <w:t xml:space="preserve">do giáo viên đặt — tiêu đề mục</w:t>
+            </w:r>
+            <w:r>
+              <w:t xml:space="preserve"> </w:t>
+            </w:r>
+            <w:r>
+              <w:rPr>
+                <w:rStyle w:val="VerbatimChar"/>
+              </w:rPr>
+              <w:t xml:space="preserve">h2</w:t>
+            </w:r>
+            <w:r>
+              <w:t xml:space="preserve"> </w:t>
+            </w:r>
+            <w:r>
+              <w:t xml:space="preserve">(sans, gạch dưới</w:t>
+            </w:r>
+            <w:r>
+              <w:t xml:space="preserve"> </w:t>
+            </w:r>
+            <w:r>
+              <w:rPr>
+                <w:rStyle w:val="VerbatimChar"/>
+              </w:rPr>
+              <w:t xml:space="preserve">neutral-100</w:t>
+            </w:r>
+            <w:r>
+              <w:t xml:space="preserve">) không sửa / xoá / đổi thứ tự được. Thanh công cụ dính trên cùng: hoàn tác, đoạn / tiêu đề nhỏ / tiêu đề con, đậm / nghiêng / gạch chân, danh sách, trích khối, khối code (tô màu cú pháp theo token), bảng, hình (upload ≤ 5 MB), công thức LaTeX (KaTeX, có xem trước). Nút đang bật:</w:t>
+            </w:r>
+            <w:r>
+              <w:t xml:space="preserve"> </w:t>
+            </w:r>
+            <w:r>
+              <w:rPr>
+                <w:rStyle w:val="VerbatimChar"/>
+              </w:rPr>
+              <w:t xml:space="preserve">primary</w:t>
+            </w:r>
+            <w:r>
+              <w:t xml:space="preserve"> </w:t>
+            </w:r>
+            <w:r>
+              <w:t xml:space="preserve">ghost</w:t>
+            </w:r>
+          </w:p>
+        </w:tc>
+        <w:tc>
+          <w:tcPr/>
+          <w:p>
+            <w:pPr>
+              <w:pStyle w:val="Compact"/>
+            </w:pPr>
+            <w:r>
+              <w:t xml:space="preserve">Chỉ đọc: ẩn thanh công cụ (nhóm đã nộp / bài đóng). Thanh trạng thái dưới: số từ + PaperSyncIndicator</w:t>
+            </w:r>
+          </w:p>
+        </w:tc>
+      </w:tr>
+      <w:tr>
+        <w:tc>
+          <w:tcPr/>
+          <w:p>
+            <w:pPr>
+              <w:pStyle w:val="Compact"/>
+            </w:pPr>
+            <w:r>
+              <w:rPr>
+                <w:b/>
+                <w:bCs/>
+              </w:rPr>
+              <w:t xml:space="preserve">PaperOutline</w:t>
+            </w:r>
+            <w:r>
+              <w:t xml:space="preserve"> </w:t>
+            </w:r>
+            <w:r>
+              <w:t xml:space="preserve">(Mức 4)</w:t>
+            </w:r>
+          </w:p>
+        </w:tc>
+        <w:tc>
+          <w:tcPr/>
+          <w:p>
+            <w:pPr>
+              <w:pStyle w:val="Compact"/>
+            </w:pPr>
+            <w:r>
+              <w:t xml:space="preserve">Mục lục của paper ở cột trái (trên đề bài; điện thoại: mục thu gọn "Mục lục &amp; số từ"). Mỗi mục: icon + tên (dấu</w:t>
+            </w:r>
+            <w:r>
+              <w:t xml:space="preserve"> </w:t>
+            </w:r>
+            <w:r>
+              <w:rPr>
+                <w:rStyle w:val="VerbatimChar"/>
+              </w:rPr>
+              <w:t xml:space="preserve">*</w:t>
+            </w:r>
+            <w:r>
+              <w:t xml:space="preserve"> </w:t>
+            </w:r>
+            <w:r>
+              <w:t xml:space="preserve">màu</w:t>
+            </w:r>
+            <w:r>
+              <w:t xml:space="preserve"> </w:t>
+            </w:r>
+            <w:r>
+              <w:rPr>
+                <w:rStyle w:val="VerbatimChar"/>
+              </w:rPr>
+              <w:t xml:space="preserve">error</w:t>
+            </w:r>
+            <w:r>
+              <w:t xml:space="preserve"> </w:t>
+            </w:r>
+            <w:r>
+              <w:t xml:space="preserve">nếu bắt buộc) + dòng</w:t>
+            </w:r>
+            <w:r>
+              <w:t xml:space="preserve"> </w:t>
+            </w:r>
+            <w:r>
+              <w:rPr>
+                <w:rStyle w:val="VerbatimChar"/>
+              </w:rPr>
+              <w:t xml:space="preserve">caption</w:t>
+            </w:r>
+            <w:r>
+              <w:t xml:space="preserve"> </w:t>
+            </w:r>
+            <w:r>
+              <w:t xml:space="preserve">"120 từ / 150–600 từ". Màu theo</w:t>
+            </w:r>
+            <w:r>
+              <w:t xml:space="preserve"> </w:t>
+            </w:r>
+            <w:r>
+              <w:rPr>
+                <w:rStyle w:val="VerbatimChar"/>
+              </w:rPr>
+              <w:t xml:space="preserve">PAPER_WORD_HINT_META</w:t>
+            </w:r>
+            <w:r>
+              <w:t xml:space="preserve">: đạt</w:t>
+            </w:r>
+            <w:r>
+              <w:t xml:space="preserve"> </w:t>
+            </w:r>
+            <w:r>
+              <w:rPr>
+                <w:rStyle w:val="VerbatimChar"/>
+              </w:rPr>
+              <w:t xml:space="preserve">success</w:t>
+            </w:r>
+            <w:r>
+              <w:t xml:space="preserve">, còn thiếu / vượt</w:t>
+            </w:r>
+            <w:r>
+              <w:t xml:space="preserve"> </w:t>
+            </w:r>
+            <w:r>
+              <w:rPr>
+                <w:rStyle w:val="VerbatimChar"/>
+              </w:rPr>
+              <w:t xml:space="preserve">warning</w:t>
+            </w:r>
+            <w:r>
+              <w:t xml:space="preserve">, mục bắt buộc chưa viết</w:t>
+            </w:r>
+            <w:r>
+              <w:t xml:space="preserve"> </w:t>
+            </w:r>
+            <w:r>
+              <w:rPr>
+                <w:rStyle w:val="VerbatimChar"/>
+              </w:rPr>
+              <w:t xml:space="preserve">error</w:t>
+            </w:r>
+            <w:r>
+              <w:t xml:space="preserve">, mục không bắt buộc chưa viết</w:t>
+            </w:r>
+            <w:r>
+              <w:t xml:space="preserve"> </w:t>
+            </w:r>
+            <w:r>
+              <w:rPr>
+                <w:rStyle w:val="VerbatimChar"/>
+              </w:rPr>
+              <w:t xml:space="preserve">neutral-500</w:t>
+            </w:r>
+            <w:r>
+              <w:t xml:space="preserve">. Dưới cùng: tổng số từ cả bài</w:t>
+            </w:r>
+          </w:p>
+        </w:tc>
+        <w:tc>
+          <w:tcPr/>
+          <w:p>
+            <w:pPr>
+              <w:pStyle w:val="Compact"/>
+            </w:pPr>
+            <w:r>
+              <w:t xml:space="preserve">Bấm một mục → cuộn tới mục đó (chừa header + thanh công cụ). Chỉ nhắc, không chặn nộp (BR-29)</w:t>
+            </w:r>
+          </w:p>
+        </w:tc>
+      </w:tr>
+      <w:tr>
+        <w:tc>
+          <w:tcPr/>
+          <w:p>
+            <w:pPr>
+              <w:pStyle w:val="Compact"/>
+            </w:pPr>
+            <w:r>
+              <w:rPr>
+                <w:b/>
+                <w:bCs/>
+              </w:rPr>
+              <w:t xml:space="preserve">Trích dẫn trong PaperEditor</w:t>
+            </w:r>
+            <w:r>
+              <w:t xml:space="preserve"> </w:t>
+            </w:r>
+            <w:r>
+              <w:t xml:space="preserve">(Mức 4)</w:t>
+            </w:r>
+          </w:p>
+        </w:tc>
+        <w:tc>
+          <w:tcPr/>
+          <w:p>
+            <w:pPr>
+              <w:pStyle w:val="Compact"/>
+            </w:pPr>
+            <w:r>
+              <w:t xml:space="preserve">Nút</w:t>
+            </w:r>
+            <w:r>
+              <w:t xml:space="preserve"> </w:t>
+            </w:r>
+            <w:r>
+              <w:rPr>
+                <w:b/>
+                <w:bCs/>
+              </w:rPr>
+              <w:t xml:space="preserve">Chèn trích dẫn</w:t>
+            </w:r>
+            <w:r>
+              <w:t xml:space="preserve"> </w:t>
+            </w:r>
+            <w:r>
+              <w:t xml:space="preserve">(icon sách) cuối thanh công cụ mở</w:t>
+            </w:r>
+            <w:r>
+              <w:t xml:space="preserve"> </w:t>
+            </w:r>
+            <w:r>
+              <w:rPr>
+                <w:b/>
+                <w:bCs/>
+              </w:rPr>
+              <w:t xml:space="preserve">CitationPicker</w:t>
+            </w:r>
+            <w:r>
+              <w:t xml:space="preserve"> </w:t>
+            </w:r>
+            <w:r>
+              <w:t xml:space="preserve">(Modal 680px: ô tìm, danh sách tài liệu đã định dạng có Checkbox — chọn nhiều, thứ tự theo lúc bấm; nút "Thêm tài liệu vào thư viện"; sửa thì có "Bỏ trích dẫn"). Trích dẫn trong bài: chữ</w:t>
+            </w:r>
+            <w:r>
+              <w:t xml:space="preserve"> </w:t>
+            </w:r>
+            <w:r>
+              <w:rPr>
+                <w:rStyle w:val="VerbatimChar"/>
+              </w:rPr>
+              <w:t xml:space="preserve">brand-700</w:t>
+            </w:r>
+            <w:r>
+              <w:t xml:space="preserve">, nền</w:t>
+            </w:r>
+            <w:r>
+              <w:t xml:space="preserve"> </w:t>
+            </w:r>
+            <w:r>
+              <w:rPr>
+                <w:rStyle w:val="VerbatimChar"/>
+              </w:rPr>
+              <w:t xml:space="preserve">brand-50</w:t>
+            </w:r>
+            <w:r>
+              <w:t xml:space="preserve"> </w:t>
+            </w:r>
+            <w:r>
+              <w:t xml:space="preserve">khi hover, viền</w:t>
+            </w:r>
+            <w:r>
+              <w:t xml:space="preserve"> </w:t>
+            </w:r>
+            <w:r>
+              <w:rPr>
+                <w:rStyle w:val="VerbatimChar"/>
+              </w:rPr>
+              <w:t xml:space="preserve">brand-500</w:t>
+            </w:r>
+            <w:r>
+              <w:t xml:space="preserve"> </w:t>
+            </w:r>
+            <w:r>
+              <w:t xml:space="preserve">khi chọn; nhãn</w:t>
+            </w:r>
+            <w:r>
+              <w:t xml:space="preserve"> </w:t>
+            </w:r>
+            <w:r>
+              <w:rPr>
+                <w:rStyle w:val="VerbatimChar"/>
+              </w:rPr>
+              <w:t xml:space="preserve">[1]</w:t>
+            </w:r>
+            <w:r>
+              <w:t xml:space="preserve">,</w:t>
+            </w:r>
+            <w:r>
+              <w:t xml:space="preserve"> </w:t>
+            </w:r>
+            <w:r>
+              <w:rPr>
+                <w:rStyle w:val="VerbatimChar"/>
+              </w:rPr>
+              <w:t xml:space="preserve">[1]–[3]</w:t>
+            </w:r>
+            <w:r>
+              <w:t xml:space="preserve"> </w:t>
+            </w:r>
+            <w:r>
+              <w:t xml:space="preserve">(IEEE) hoặc</w:t>
+            </w:r>
+            <w:r>
+              <w:t xml:space="preserve"> </w:t>
+            </w:r>
+            <w:r>
+              <w:rPr>
+                <w:rStyle w:val="VerbatimChar"/>
+              </w:rPr>
+              <w:t xml:space="preserve">(LeCun et al., 2015)</w:t>
+            </w:r>
+            <w:r>
+              <w:t xml:space="preserve"> </w:t>
+            </w:r>
+            <w:r>
+              <w:t xml:space="preserve">(APA) tự đánh lại khi đổi thứ tự / thư viện; tài liệu đã xoá →</w:t>
+            </w:r>
+            <w:r>
+              <w:t xml:space="preserve"> </w:t>
+            </w:r>
+            <w:r>
+              <w:rPr>
+                <w:rStyle w:val="VerbatimChar"/>
+              </w:rPr>
+              <w:t xml:space="preserve">[?]</w:t>
+            </w:r>
+            <w:r>
+              <w:t xml:space="preserve">. Cuối tờ giấy:</w:t>
+            </w:r>
+            <w:r>
+              <w:t xml:space="preserve"> </w:t>
+            </w:r>
+            <w:r>
+              <w:rPr>
+                <w:b/>
+                <w:bCs/>
+              </w:rPr>
+              <w:t xml:space="preserve">References</w:t>
+            </w:r>
+            <w:r>
+              <w:t xml:space="preserve"> </w:t>
+            </w:r>
+            <w:r>
+              <w:t xml:space="preserve">(h2) + chú thích</w:t>
+            </w:r>
+            <w:r>
+              <w:t xml:space="preserve"> </w:t>
+            </w:r>
+            <w:r>
+              <w:rPr>
+                <w:rStyle w:val="VerbatimChar"/>
+              </w:rPr>
+              <w:t xml:space="preserve">caption</w:t>
+            </w:r>
+            <w:r>
+              <w:t xml:space="preserve"> </w:t>
+            </w:r>
+            <w:r>
+              <w:t xml:space="preserve">"Tự sinh từ các trích dẫn…", mục font</w:t>
+            </w:r>
+            <w:r>
+              <w:t xml:space="preserve"> </w:t>
+            </w:r>
+            <w:r>
+              <w:rPr>
+                <w:rStyle w:val="VerbatimChar"/>
+              </w:rPr>
+              <w:t xml:space="preserve">serif</w:t>
+            </w:r>
+            <w:r>
+              <w:t xml:space="preserve"> </w:t>
+            </w:r>
+            <w:r>
+              <w:t xml:space="preserve">15/26, APA thụt dòng treo 32px</w:t>
+            </w:r>
+          </w:p>
+        </w:tc>
+        <w:tc>
+          <w:tcPr/>
+          <w:p>
+            <w:pPr>
+              <w:pStyle w:val="Compact"/>
+            </w:pPr>
+            <w:r>
+              <w:t xml:space="preserve">Bấm vào trích dẫn → sửa (chỉ khi soạn được). Chưa trích dẫn → "Chưa có trích dẫn nào trong bài."</w:t>
+            </w:r>
+          </w:p>
+        </w:tc>
+      </w:tr>
+      <w:tr>
+        <w:tc>
+          <w:tcPr/>
+          <w:p>
+            <w:pPr>
+              <w:pStyle w:val="Compact"/>
+            </w:pPr>
+            <w:r>
+              <w:rPr>
+                <w:b/>
+                <w:bCs/>
+              </w:rPr>
+              <w:t xml:space="preserve">ReferenceLibrary</w:t>
+            </w:r>
+            <w:r>
+              <w:t xml:space="preserve"> </w:t>
+            </w:r>
+            <w:r>
+              <w:t xml:space="preserve">(Mức 4)</w:t>
+            </w:r>
+          </w:p>
+        </w:tc>
+        <w:tc>
+          <w:tcPr/>
+          <w:p>
+            <w:pPr>
+              <w:pStyle w:val="Compact"/>
+            </w:pPr>
+            <w:r>
+              <w:t xml:space="preserve">Drawer 640px "Tài liệu tham khảo của nhóm" (phụ đề: kiểu trích dẫn + số tài liệu). Trên cùng: ô</w:t>
+            </w:r>
+            <w:r>
+              <w:t xml:space="preserve"> </w:t>
+            </w:r>
+            <w:r>
+              <w:rPr>
+                <w:b/>
+                <w:bCs/>
+              </w:rPr>
+              <w:t xml:space="preserve">Tra DOI</w:t>
+            </w:r>
+            <w:r>
+              <w:t xml:space="preserve"> </w:t>
+            </w:r>
+            <w:r>
+              <w:t xml:space="preserve">(Input.Search), nút</w:t>
+            </w:r>
+            <w:r>
+              <w:t xml:space="preserve"> </w:t>
+            </w:r>
+            <w:r>
+              <w:rPr>
+                <w:b/>
+                <w:bCs/>
+              </w:rPr>
+              <w:t xml:space="preserve">Nhập tay</w:t>
+            </w:r>
+            <w:r>
+              <w:t xml:space="preserve">,</w:t>
+            </w:r>
+            <w:r>
+              <w:t xml:space="preserve"> </w:t>
+            </w:r>
+            <w:r>
+              <w:rPr>
+                <w:b/>
+                <w:bCs/>
+              </w:rPr>
+              <w:t xml:space="preserve">Nhập BibTeX</w:t>
+            </w:r>
+            <w:r>
+              <w:t xml:space="preserve">. Mỗi mục là một thẻ viền</w:t>
+            </w:r>
+            <w:r>
+              <w:t xml:space="preserve"> </w:t>
+            </w:r>
+            <w:r>
+              <w:rPr>
+                <w:rStyle w:val="VerbatimChar"/>
+              </w:rPr>
+              <w:t xml:space="preserve">neutral-100</w:t>
+            </w:r>
+            <w:r>
+              <w:t xml:space="preserve">: dòng trích dẫn theo IEEE / APA (font</w:t>
+            </w:r>
+            <w:r>
+              <w:t xml:space="preserve"> </w:t>
+            </w:r>
+            <w:r>
+              <w:rPr>
+                <w:rStyle w:val="VerbatimChar"/>
+              </w:rPr>
+              <w:t xml:space="preserve">serif</w:t>
+            </w:r>
+            <w:r>
+              <w:t xml:space="preserve">, chữ thường — không HTML), dưới là Tag</w:t>
+            </w:r>
+            <w:r>
+              <w:t xml:space="preserve"> </w:t>
+            </w:r>
+            <w:r>
+              <w:rPr>
+                <w:rStyle w:val="VerbatimChar"/>
+              </w:rPr>
+              <w:t xml:space="preserve">warning</w:t>
+            </w:r>
+            <w:r>
+              <w:t xml:space="preserve"> </w:t>
+            </w:r>
+            <w:r>
+              <w:t xml:space="preserve">"Thiếu tác giả, năm…" (BR-30) + "Thêm bởi …"; bên phải nút sửa / xoá (Popconfirm). Form nhập tay / sửa và hộp nhập BibTeX (dán chữ hoặc chọn file</w:t>
+            </w:r>
+            <w:r>
+              <w:t xml:space="preserve"> </w:t>
+            </w:r>
+            <w:r>
+              <w:rPr>
+                <w:rStyle w:val="VerbatimChar"/>
+              </w:rPr>
+              <w:t xml:space="preserve">.bib</w:t>
+            </w:r>
+            <w:r>
+              <w:t xml:space="preserve">, xem trước danh sách đã định dạng) là Modal</w:t>
+            </w:r>
+          </w:p>
+        </w:tc>
+        <w:tc>
+          <w:tcPr/>
+          <w:p>
+            <w:pPr>
+              <w:pStyle w:val="Compact"/>
+            </w:pPr>
+            <w:r>
+              <w:t xml:space="preserve">Chỉ xem (giáo viên, tài liệu chỉ đọc): ẩn ô tra và nút sửa. Rỗng: Empty kèm hướng dẫn 3 cách thêm</w:t>
+            </w:r>
+          </w:p>
+        </w:tc>
+      </w:tr>
+      <w:tr>
+        <w:tc>
+          <w:tcPr/>
+          <w:p>
+            <w:pPr>
+              <w:pStyle w:val="Compact"/>
+            </w:pPr>
+            <w:r>
+              <w:rPr>
+                <w:b/>
+                <w:bCs/>
+              </w:rPr>
+              <w:t xml:space="preserve">PaperSyncIndicator</w:t>
+            </w:r>
+          </w:p>
+        </w:tc>
+        <w:tc>
+          <w:tcPr/>
+          <w:p>
+            <w:pPr>
+              <w:pStyle w:val="Compact"/>
+            </w:pPr>
+            <w:r>
+              <w:t xml:space="preserve">Như AutosaveIndicator cho tài liệu nhóm: "Đã lưu" · "Đang lưu…" · "Mất kết nối – sẽ gửi khi có mạng" (</w:t>
+            </w:r>
+            <w:r>
+              <w:rPr>
+                <w:rStyle w:val="VerbatimChar"/>
+              </w:rPr>
+              <w:t xml:space="preserve">warning</w:t>
+            </w:r>
+            <w:r>
+              <w:t xml:space="preserve">) · "Lỗi đồng bộ – mở lại" (</w:t>
+            </w:r>
+            <w:r>
+              <w:rPr>
+                <w:rStyle w:val="VerbatimChar"/>
+              </w:rPr>
+              <w:t xml:space="preserve">error</w:t>
+            </w:r>
+            <w:r>
+              <w:t xml:space="preserve">, bấm để mở lại)</w:t>
+            </w:r>
+          </w:p>
+        </w:tc>
+        <w:tc>
+          <w:tcPr/>
+          <w:p>
+            <w:pPr>
+              <w:pStyle w:val="Compact"/>
+            </w:pPr>
+            <w:r>
+              <w:t xml:space="preserve">Không có nút lưu — mọi thay đổi gửi sau ~0,3 giây</w:t>
+            </w:r>
           </w:p>
         </w:tc>
       </w:tr>

</xml_diff>